<commit_message>
docs(er): incluir todas as colunas Excel nos worksheets com fonte compacta
- guiados 1 e 2: incluir ISBN, morada, datas completas (caso 1 biblioteca) e NIF, especialidade, localizacao (caso 2 licenciamento)
- autonomos 1, 2 e 3: incluir todas as colunas originais dos cenarios
- gerador: quando tabela tem mais de 6 colunas, usar fonte 7pt e margens compactas para caber em A4 retrato

Co-Authored-By: Claude Opus 4.6 <noreply@anthropic.com>
</commit_message>
<xml_diff>
--- a/docs/er/worksheets/worksheet-autonomo-1-obras.docx
+++ b/docs/er/worksheets/worksheet-autonomo-1-obras.docx
@@ -74,11 +74,16 @@
         </w:tblBorders>
       </w:tblPr>
       <w:tblGrid>
-        <w:gridCol w:w="1930"/>
-        <w:gridCol w:w="1927"/>
-        <w:gridCol w:w="1927"/>
-        <w:gridCol w:w="1927"/>
-        <w:gridCol w:w="1927"/>
+        <w:gridCol w:w="971"/>
+        <w:gridCol w:w="963"/>
+        <w:gridCol w:w="963"/>
+        <w:gridCol w:w="963"/>
+        <w:gridCol w:w="963"/>
+        <w:gridCol w:w="963"/>
+        <w:gridCol w:w="963"/>
+        <w:gridCol w:w="963"/>
+        <w:gridCol w:w="963"/>
+        <w:gridCol w:w="963"/>
       </w:tblGrid>
       <w:tr>
         <w:trPr>
@@ -86,7 +91,7 @@
         </w:trPr>
         <w:tc>
           <w:tcPr>
-            <w:tcW w:type="dxa" w:w="1930"/>
+            <w:tcW w:type="dxa" w:w="971"/>
             <w:tcBorders>
               <w:top w:val="single" w:color="AAAAAA" w:sz="4"/>
               <w:left w:val="single" w:color="AAAAAA" w:sz="4"/>
@@ -107,8 +112,8 @@
                 <w:b/>
                 <w:bCs/>
                 <w:color w:val="FFFFFF"/>
-                <w:sz w:val="20"/>
-                <w:szCs w:val="20"/>
+                <w:sz w:val="14"/>
+                <w:szCs w:val="14"/>
               </w:rPr>
               <w:t xml:space="preserve">Obra</w:t>
             </w:r>
@@ -116,7 +121,7 @@
         </w:tc>
         <w:tc>
           <w:tcPr>
-            <w:tcW w:type="dxa" w:w="1927"/>
+            <w:tcW w:type="dxa" w:w="963"/>
             <w:tcBorders>
               <w:top w:val="single" w:color="AAAAAA" w:sz="4"/>
               <w:left w:val="single" w:color="AAAAAA" w:sz="4"/>
@@ -137,16 +142,16 @@
                 <w:b/>
                 <w:bCs/>
                 <w:color w:val="FFFFFF"/>
-                <w:sz w:val="20"/>
-                <w:szCs w:val="20"/>
-              </w:rPr>
-              <w:t xml:space="preserve">Empreiteiro</w:t>
-            </w:r>
-          </w:p>
-        </w:tc>
-        <w:tc>
-          <w:tcPr>
-            <w:tcW w:type="dxa" w:w="1927"/>
+                <w:sz w:val="14"/>
+                <w:szCs w:val="14"/>
+              </w:rPr>
+              <w:t xml:space="preserve">Local</w:t>
+            </w:r>
+          </w:p>
+        </w:tc>
+        <w:tc>
+          <w:tcPr>
+            <w:tcW w:type="dxa" w:w="963"/>
             <w:tcBorders>
               <w:top w:val="single" w:color="AAAAAA" w:sz="4"/>
               <w:left w:val="single" w:color="AAAAAA" w:sz="4"/>
@@ -167,16 +172,16 @@
                 <w:b/>
                 <w:bCs/>
                 <w:color w:val="FFFFFF"/>
-                <w:sz w:val="20"/>
-                <w:szCs w:val="20"/>
-              </w:rPr>
-              <w:t xml:space="preserve">NIFEmpr.</w:t>
-            </w:r>
-          </w:p>
-        </w:tc>
-        <w:tc>
-          <w:tcPr>
-            <w:tcW w:type="dxa" w:w="1927"/>
+                <w:sz w:val="14"/>
+                <w:szCs w:val="14"/>
+              </w:rPr>
+              <w:t xml:space="preserve">Empreiteiro</w:t>
+            </w:r>
+          </w:p>
+        </w:tc>
+        <w:tc>
+          <w:tcPr>
+            <w:tcW w:type="dxa" w:w="963"/>
             <w:tcBorders>
               <w:top w:val="single" w:color="AAAAAA" w:sz="4"/>
               <w:left w:val="single" w:color="AAAAAA" w:sz="4"/>
@@ -197,16 +202,16 @@
                 <w:b/>
                 <w:bCs/>
                 <w:color w:val="FFFFFF"/>
-                <w:sz w:val="20"/>
-                <w:szCs w:val="20"/>
-              </w:rPr>
-              <w:t xml:space="preserve">Fiscal</w:t>
-            </w:r>
-          </w:p>
-        </w:tc>
-        <w:tc>
-          <w:tcPr>
-            <w:tcW w:type="dxa" w:w="1927"/>
+                <w:sz w:val="14"/>
+                <w:szCs w:val="14"/>
+              </w:rPr>
+              <w:t xml:space="preserve">NIFEmpr.</w:t>
+            </w:r>
+          </w:p>
+        </w:tc>
+        <w:tc>
+          <w:tcPr>
+            <w:tcW w:type="dxa" w:w="963"/>
             <w:tcBorders>
               <w:top w:val="single" w:color="AAAAAA" w:sz="4"/>
               <w:left w:val="single" w:color="AAAAAA" w:sz="4"/>
@@ -227,10 +232,160 @@
                 <w:b/>
                 <w:bCs/>
                 <w:color w:val="FFFFFF"/>
-                <w:sz w:val="20"/>
-                <w:szCs w:val="20"/>
+                <w:sz w:val="14"/>
+                <w:szCs w:val="14"/>
+              </w:rPr>
+              <w:t xml:space="preserve">Contacto</w:t>
+            </w:r>
+          </w:p>
+        </w:tc>
+        <w:tc>
+          <w:tcPr>
+            <w:tcW w:type="dxa" w:w="963"/>
+            <w:tcBorders>
+              <w:top w:val="single" w:color="AAAAAA" w:sz="4"/>
+              <w:left w:val="single" w:color="AAAAAA" w:sz="4"/>
+              <w:bottom w:val="single" w:color="AAAAAA" w:sz="4"/>
+              <w:right w:val="single" w:color="AAAAAA" w:sz="4"/>
+            </w:tcBorders>
+            <w:shd w:fill="1F3864" w:val="clear"/>
+            <w:tcMar>
+              <w:top w:type="dxa" w:w="80"/>
+              <w:left w:type="dxa" w:w="120"/>
+              <w:bottom w:type="dxa" w:w="80"/>
+              <w:right w:type="dxa" w:w="120"/>
+            </w:tcMar>
+          </w:tcPr>
+          <w:p>
+            <w:r>
+              <w:rPr>
+                <w:b/>
+                <w:bCs/>
+                <w:color w:val="FFFFFF"/>
+                <w:sz w:val="14"/>
+                <w:szCs w:val="14"/>
+              </w:rPr>
+              <w:t xml:space="preserve">Fiscal</w:t>
+            </w:r>
+          </w:p>
+        </w:tc>
+        <w:tc>
+          <w:tcPr>
+            <w:tcW w:type="dxa" w:w="963"/>
+            <w:tcBorders>
+              <w:top w:val="single" w:color="AAAAAA" w:sz="4"/>
+              <w:left w:val="single" w:color="AAAAAA" w:sz="4"/>
+              <w:bottom w:val="single" w:color="AAAAAA" w:sz="4"/>
+              <w:right w:val="single" w:color="AAAAAA" w:sz="4"/>
+            </w:tcBorders>
+            <w:shd w:fill="1F3864" w:val="clear"/>
+            <w:tcMar>
+              <w:top w:type="dxa" w:w="80"/>
+              <w:left w:type="dxa" w:w="120"/>
+              <w:bottom w:type="dxa" w:w="80"/>
+              <w:right w:type="dxa" w:w="120"/>
+            </w:tcMar>
+          </w:tcPr>
+          <w:p>
+            <w:r>
+              <w:rPr>
+                <w:b/>
+                <w:bCs/>
+                <w:color w:val="FFFFFF"/>
+                <w:sz w:val="14"/>
+                <w:szCs w:val="14"/>
+              </w:rPr>
+              <w:t xml:space="preserve">DataInício</w:t>
+            </w:r>
+          </w:p>
+        </w:tc>
+        <w:tc>
+          <w:tcPr>
+            <w:tcW w:type="dxa" w:w="963"/>
+            <w:tcBorders>
+              <w:top w:val="single" w:color="AAAAAA" w:sz="4"/>
+              <w:left w:val="single" w:color="AAAAAA" w:sz="4"/>
+              <w:bottom w:val="single" w:color="AAAAAA" w:sz="4"/>
+              <w:right w:val="single" w:color="AAAAAA" w:sz="4"/>
+            </w:tcBorders>
+            <w:shd w:fill="1F3864" w:val="clear"/>
+            <w:tcMar>
+              <w:top w:type="dxa" w:w="80"/>
+              <w:left w:type="dxa" w:w="120"/>
+              <w:bottom w:type="dxa" w:w="80"/>
+              <w:right w:type="dxa" w:w="120"/>
+            </w:tcMar>
+          </w:tcPr>
+          <w:p>
+            <w:r>
+              <w:rPr>
+                <w:b/>
+                <w:bCs/>
+                <w:color w:val="FFFFFF"/>
+                <w:sz w:val="14"/>
+                <w:szCs w:val="14"/>
+              </w:rPr>
+              <w:t xml:space="preserve">DataFim</w:t>
+            </w:r>
+          </w:p>
+        </w:tc>
+        <w:tc>
+          <w:tcPr>
+            <w:tcW w:type="dxa" w:w="963"/>
+            <w:tcBorders>
+              <w:top w:val="single" w:color="AAAAAA" w:sz="4"/>
+              <w:left w:val="single" w:color="AAAAAA" w:sz="4"/>
+              <w:bottom w:val="single" w:color="AAAAAA" w:sz="4"/>
+              <w:right w:val="single" w:color="AAAAAA" w:sz="4"/>
+            </w:tcBorders>
+            <w:shd w:fill="1F3864" w:val="clear"/>
+            <w:tcMar>
+              <w:top w:type="dxa" w:w="80"/>
+              <w:left w:type="dxa" w:w="120"/>
+              <w:bottom w:type="dxa" w:w="80"/>
+              <w:right w:type="dxa" w:w="120"/>
+            </w:tcMar>
+          </w:tcPr>
+          <w:p>
+            <w:r>
+              <w:rPr>
+                <w:b/>
+                <w:bCs/>
+                <w:color w:val="FFFFFF"/>
+                <w:sz w:val="14"/>
+                <w:szCs w:val="14"/>
               </w:rPr>
               <w:t xml:space="preserve">Valor</w:t>
+            </w:r>
+          </w:p>
+        </w:tc>
+        <w:tc>
+          <w:tcPr>
+            <w:tcW w:type="dxa" w:w="963"/>
+            <w:tcBorders>
+              <w:top w:val="single" w:color="AAAAAA" w:sz="4"/>
+              <w:left w:val="single" w:color="AAAAAA" w:sz="4"/>
+              <w:bottom w:val="single" w:color="AAAAAA" w:sz="4"/>
+              <w:right w:val="single" w:color="AAAAAA" w:sz="4"/>
+            </w:tcBorders>
+            <w:shd w:fill="1F3864" w:val="clear"/>
+            <w:tcMar>
+              <w:top w:type="dxa" w:w="80"/>
+              <w:left w:type="dxa" w:w="120"/>
+              <w:bottom w:type="dxa" w:w="80"/>
+              <w:right w:type="dxa" w:w="120"/>
+            </w:tcMar>
+          </w:tcPr>
+          <w:p>
+            <w:r>
+              <w:rPr>
+                <w:b/>
+                <w:bCs/>
+                <w:color w:val="FFFFFF"/>
+                <w:sz w:val="14"/>
+                <w:szCs w:val="14"/>
+              </w:rPr>
+              <w:t xml:space="preserve">Estado</w:t>
             </w:r>
           </w:p>
         </w:tc>
@@ -238,25 +393,25 @@
       <w:tr>
         <w:tc>
           <w:tcPr>
-            <w:tcW w:type="dxa" w:w="1930"/>
-            <w:tcBorders>
-              <w:top w:val="single" w:color="AAAAAA" w:sz="4"/>
-              <w:left w:val="single" w:color="AAAAAA" w:sz="4"/>
-              <w:bottom w:val="single" w:color="AAAAAA" w:sz="4"/>
-              <w:right w:val="single" w:color="AAAAAA" w:sz="4"/>
-            </w:tcBorders>
-            <w:tcMar>
-              <w:top w:type="dxa" w:w="80"/>
-              <w:left w:type="dxa" w:w="120"/>
-              <w:bottom w:type="dxa" w:w="80"/>
-              <w:right w:type="dxa" w:w="120"/>
-            </w:tcMar>
-          </w:tcPr>
-          <w:p>
-            <w:r>
-              <w:rPr>
-                <w:sz w:val="20"/>
-                <w:szCs w:val="20"/>
+            <w:tcW w:type="dxa" w:w="971"/>
+            <w:tcBorders>
+              <w:top w:val="single" w:color="AAAAAA" w:sz="4"/>
+              <w:left w:val="single" w:color="AAAAAA" w:sz="4"/>
+              <w:bottom w:val="single" w:color="AAAAAA" w:sz="4"/>
+              <w:right w:val="single" w:color="AAAAAA" w:sz="4"/>
+            </w:tcBorders>
+            <w:tcMar>
+              <w:top w:type="dxa" w:w="40"/>
+              <w:left w:type="dxa" w:w="80"/>
+              <w:bottom w:type="dxa" w:w="40"/>
+              <w:right w:type="dxa" w:w="80"/>
+            </w:tcMar>
+          </w:tcPr>
+          <w:p>
+            <w:r>
+              <w:rPr>
+                <w:sz w:val="14"/>
+                <w:szCs w:val="14"/>
               </w:rPr>
               <w:t xml:space="preserve">Requal. EN8</w:t>
             </w:r>
@@ -264,25 +419,51 @@
         </w:tc>
         <w:tc>
           <w:tcPr>
-            <w:tcW w:type="dxa" w:w="1927"/>
-            <w:tcBorders>
-              <w:top w:val="single" w:color="AAAAAA" w:sz="4"/>
-              <w:left w:val="single" w:color="AAAAAA" w:sz="4"/>
-              <w:bottom w:val="single" w:color="AAAAAA" w:sz="4"/>
-              <w:right w:val="single" w:color="AAAAAA" w:sz="4"/>
-            </w:tcBorders>
-            <w:tcMar>
-              <w:top w:type="dxa" w:w="80"/>
-              <w:left w:type="dxa" w:w="120"/>
-              <w:bottom w:type="dxa" w:w="80"/>
-              <w:right w:type="dxa" w:w="120"/>
-            </w:tcMar>
-          </w:tcPr>
-          <w:p>
-            <w:r>
-              <w:rPr>
-                <w:sz w:val="20"/>
-                <w:szCs w:val="20"/>
+            <w:tcW w:type="dxa" w:w="963"/>
+            <w:tcBorders>
+              <w:top w:val="single" w:color="AAAAAA" w:sz="4"/>
+              <w:left w:val="single" w:color="AAAAAA" w:sz="4"/>
+              <w:bottom w:val="single" w:color="AAAAAA" w:sz="4"/>
+              <w:right w:val="single" w:color="AAAAAA" w:sz="4"/>
+            </w:tcBorders>
+            <w:tcMar>
+              <w:top w:type="dxa" w:w="40"/>
+              <w:left w:type="dxa" w:w="80"/>
+              <w:bottom w:type="dxa" w:w="40"/>
+              <w:right w:type="dxa" w:w="80"/>
+            </w:tcMar>
+          </w:tcPr>
+          <w:p>
+            <w:r>
+              <w:rPr>
+                <w:sz w:val="14"/>
+                <w:szCs w:val="14"/>
+              </w:rPr>
+              <w:t xml:space="preserve">Km 45-52</w:t>
+            </w:r>
+          </w:p>
+        </w:tc>
+        <w:tc>
+          <w:tcPr>
+            <w:tcW w:type="dxa" w:w="963"/>
+            <w:tcBorders>
+              <w:top w:val="single" w:color="AAAAAA" w:sz="4"/>
+              <w:left w:val="single" w:color="AAAAAA" w:sz="4"/>
+              <w:bottom w:val="single" w:color="AAAAAA" w:sz="4"/>
+              <w:right w:val="single" w:color="AAAAAA" w:sz="4"/>
+            </w:tcBorders>
+            <w:tcMar>
+              <w:top w:type="dxa" w:w="40"/>
+              <w:left w:type="dxa" w:w="80"/>
+              <w:bottom w:type="dxa" w:w="40"/>
+              <w:right w:type="dxa" w:w="80"/>
+            </w:tcMar>
+          </w:tcPr>
+          <w:p>
+            <w:r>
+              <w:rPr>
+                <w:sz w:val="14"/>
+                <w:szCs w:val="14"/>
               </w:rPr>
               <w:t xml:space="preserve">Construções Silva</w:t>
             </w:r>
@@ -290,25 +471,25 @@
         </w:tc>
         <w:tc>
           <w:tcPr>
-            <w:tcW w:type="dxa" w:w="1927"/>
-            <w:tcBorders>
-              <w:top w:val="single" w:color="AAAAAA" w:sz="4"/>
-              <w:left w:val="single" w:color="AAAAAA" w:sz="4"/>
-              <w:bottom w:val="single" w:color="AAAAAA" w:sz="4"/>
-              <w:right w:val="single" w:color="AAAAAA" w:sz="4"/>
-            </w:tcBorders>
-            <w:tcMar>
-              <w:top w:type="dxa" w:w="80"/>
-              <w:left w:type="dxa" w:w="120"/>
-              <w:bottom w:type="dxa" w:w="80"/>
-              <w:right w:type="dxa" w:w="120"/>
-            </w:tcMar>
-          </w:tcPr>
-          <w:p>
-            <w:r>
-              <w:rPr>
-                <w:sz w:val="20"/>
-                <w:szCs w:val="20"/>
+            <w:tcW w:type="dxa" w:w="963"/>
+            <w:tcBorders>
+              <w:top w:val="single" w:color="AAAAAA" w:sz="4"/>
+              <w:left w:val="single" w:color="AAAAAA" w:sz="4"/>
+              <w:bottom w:val="single" w:color="AAAAAA" w:sz="4"/>
+              <w:right w:val="single" w:color="AAAAAA" w:sz="4"/>
+            </w:tcBorders>
+            <w:tcMar>
+              <w:top w:type="dxa" w:w="40"/>
+              <w:left w:type="dxa" w:w="80"/>
+              <w:bottom w:type="dxa" w:w="40"/>
+              <w:right w:type="dxa" w:w="80"/>
+            </w:tcMar>
+          </w:tcPr>
+          <w:p>
+            <w:r>
+              <w:rPr>
+                <w:sz w:val="14"/>
+                <w:szCs w:val="14"/>
               </w:rPr>
               <w:t xml:space="preserve">501234567</w:t>
             </w:r>
@@ -316,25 +497,51 @@
         </w:tc>
         <w:tc>
           <w:tcPr>
-            <w:tcW w:type="dxa" w:w="1927"/>
-            <w:tcBorders>
-              <w:top w:val="single" w:color="AAAAAA" w:sz="4"/>
-              <w:left w:val="single" w:color="AAAAAA" w:sz="4"/>
-              <w:bottom w:val="single" w:color="AAAAAA" w:sz="4"/>
-              <w:right w:val="single" w:color="AAAAAA" w:sz="4"/>
-            </w:tcBorders>
-            <w:tcMar>
-              <w:top w:type="dxa" w:w="80"/>
-              <w:left w:type="dxa" w:w="120"/>
-              <w:bottom w:type="dxa" w:w="80"/>
-              <w:right w:type="dxa" w:w="120"/>
-            </w:tcMar>
-          </w:tcPr>
-          <w:p>
-            <w:r>
-              <w:rPr>
-                <w:sz w:val="20"/>
-                <w:szCs w:val="20"/>
+            <w:tcW w:type="dxa" w:w="963"/>
+            <w:tcBorders>
+              <w:top w:val="single" w:color="AAAAAA" w:sz="4"/>
+              <w:left w:val="single" w:color="AAAAAA" w:sz="4"/>
+              <w:bottom w:val="single" w:color="AAAAAA" w:sz="4"/>
+              <w:right w:val="single" w:color="AAAAAA" w:sz="4"/>
+            </w:tcBorders>
+            <w:tcMar>
+              <w:top w:type="dxa" w:w="40"/>
+              <w:left w:type="dxa" w:w="80"/>
+              <w:bottom w:type="dxa" w:w="40"/>
+              <w:right w:type="dxa" w:w="80"/>
+            </w:tcMar>
+          </w:tcPr>
+          <w:p>
+            <w:r>
+              <w:rPr>
+                <w:sz w:val="14"/>
+                <w:szCs w:val="14"/>
+              </w:rPr>
+              <w:t xml:space="preserve">J. Silva / 918...</w:t>
+            </w:r>
+          </w:p>
+        </w:tc>
+        <w:tc>
+          <w:tcPr>
+            <w:tcW w:type="dxa" w:w="963"/>
+            <w:tcBorders>
+              <w:top w:val="single" w:color="AAAAAA" w:sz="4"/>
+              <w:left w:val="single" w:color="AAAAAA" w:sz="4"/>
+              <w:bottom w:val="single" w:color="AAAAAA" w:sz="4"/>
+              <w:right w:val="single" w:color="AAAAAA" w:sz="4"/>
+            </w:tcBorders>
+            <w:tcMar>
+              <w:top w:type="dxa" w:w="40"/>
+              <w:left w:type="dxa" w:w="80"/>
+              <w:bottom w:type="dxa" w:w="40"/>
+              <w:right w:type="dxa" w:w="80"/>
+            </w:tcMar>
+          </w:tcPr>
+          <w:p>
+            <w:r>
+              <w:rPr>
+                <w:sz w:val="14"/>
+                <w:szCs w:val="14"/>
               </w:rPr>
               <w:t xml:space="preserve">Eng. Ana Costa</w:t>
             </w:r>
@@ -342,27 +549,105 @@
         </w:tc>
         <w:tc>
           <w:tcPr>
-            <w:tcW w:type="dxa" w:w="1927"/>
-            <w:tcBorders>
-              <w:top w:val="single" w:color="AAAAAA" w:sz="4"/>
-              <w:left w:val="single" w:color="AAAAAA" w:sz="4"/>
-              <w:bottom w:val="single" w:color="AAAAAA" w:sz="4"/>
-              <w:right w:val="single" w:color="AAAAAA" w:sz="4"/>
-            </w:tcBorders>
-            <w:tcMar>
-              <w:top w:type="dxa" w:w="80"/>
-              <w:left w:type="dxa" w:w="120"/>
-              <w:bottom w:type="dxa" w:w="80"/>
-              <w:right w:type="dxa" w:w="120"/>
-            </w:tcMar>
-          </w:tcPr>
-          <w:p>
-            <w:r>
-              <w:rPr>
-                <w:sz w:val="20"/>
-                <w:szCs w:val="20"/>
+            <w:tcW w:type="dxa" w:w="963"/>
+            <w:tcBorders>
+              <w:top w:val="single" w:color="AAAAAA" w:sz="4"/>
+              <w:left w:val="single" w:color="AAAAAA" w:sz="4"/>
+              <w:bottom w:val="single" w:color="AAAAAA" w:sz="4"/>
+              <w:right w:val="single" w:color="AAAAAA" w:sz="4"/>
+            </w:tcBorders>
+            <w:tcMar>
+              <w:top w:type="dxa" w:w="40"/>
+              <w:left w:type="dxa" w:w="80"/>
+              <w:bottom w:type="dxa" w:w="40"/>
+              <w:right w:type="dxa" w:w="80"/>
+            </w:tcMar>
+          </w:tcPr>
+          <w:p>
+            <w:r>
+              <w:rPr>
+                <w:sz w:val="14"/>
+                <w:szCs w:val="14"/>
+              </w:rPr>
+              <w:t xml:space="preserve">2024-09-01</w:t>
+            </w:r>
+          </w:p>
+        </w:tc>
+        <w:tc>
+          <w:tcPr>
+            <w:tcW w:type="dxa" w:w="963"/>
+            <w:tcBorders>
+              <w:top w:val="single" w:color="AAAAAA" w:sz="4"/>
+              <w:left w:val="single" w:color="AAAAAA" w:sz="4"/>
+              <w:bottom w:val="single" w:color="AAAAAA" w:sz="4"/>
+              <w:right w:val="single" w:color="AAAAAA" w:sz="4"/>
+            </w:tcBorders>
+            <w:tcMar>
+              <w:top w:type="dxa" w:w="40"/>
+              <w:left w:type="dxa" w:w="80"/>
+              <w:bottom w:type="dxa" w:w="40"/>
+              <w:right w:type="dxa" w:w="80"/>
+            </w:tcMar>
+          </w:tcPr>
+          <w:p>
+            <w:r>
+              <w:rPr>
+                <w:sz w:val="14"/>
+                <w:szCs w:val="14"/>
+              </w:rPr>
+              <w:t xml:space="preserve">2025-03-30</w:t>
+            </w:r>
+          </w:p>
+        </w:tc>
+        <w:tc>
+          <w:tcPr>
+            <w:tcW w:type="dxa" w:w="963"/>
+            <w:tcBorders>
+              <w:top w:val="single" w:color="AAAAAA" w:sz="4"/>
+              <w:left w:val="single" w:color="AAAAAA" w:sz="4"/>
+              <w:bottom w:val="single" w:color="AAAAAA" w:sz="4"/>
+              <w:right w:val="single" w:color="AAAAAA" w:sz="4"/>
+            </w:tcBorders>
+            <w:tcMar>
+              <w:top w:type="dxa" w:w="40"/>
+              <w:left w:type="dxa" w:w="80"/>
+              <w:bottom w:type="dxa" w:w="40"/>
+              <w:right w:type="dxa" w:w="80"/>
+            </w:tcMar>
+          </w:tcPr>
+          <w:p>
+            <w:r>
+              <w:rPr>
+                <w:sz w:val="14"/>
+                <w:szCs w:val="14"/>
               </w:rPr>
               <w:t xml:space="preserve">850 000€</w:t>
+            </w:r>
+          </w:p>
+        </w:tc>
+        <w:tc>
+          <w:tcPr>
+            <w:tcW w:type="dxa" w:w="963"/>
+            <w:tcBorders>
+              <w:top w:val="single" w:color="AAAAAA" w:sz="4"/>
+              <w:left w:val="single" w:color="AAAAAA" w:sz="4"/>
+              <w:bottom w:val="single" w:color="AAAAAA" w:sz="4"/>
+              <w:right w:val="single" w:color="AAAAAA" w:sz="4"/>
+            </w:tcBorders>
+            <w:tcMar>
+              <w:top w:type="dxa" w:w="40"/>
+              <w:left w:type="dxa" w:w="80"/>
+              <w:bottom w:type="dxa" w:w="40"/>
+              <w:right w:type="dxa" w:w="80"/>
+            </w:tcMar>
+          </w:tcPr>
+          <w:p>
+            <w:r>
+              <w:rPr>
+                <w:sz w:val="14"/>
+                <w:szCs w:val="14"/>
+              </w:rPr>
+              <w:t xml:space="preserve">Em curso</w:t>
             </w:r>
           </w:p>
         </w:tc>
@@ -370,25 +655,25 @@
       <w:tr>
         <w:tc>
           <w:tcPr>
-            <w:tcW w:type="dxa" w:w="1930"/>
-            <w:tcBorders>
-              <w:top w:val="single" w:color="AAAAAA" w:sz="4"/>
-              <w:left w:val="single" w:color="AAAAAA" w:sz="4"/>
-              <w:bottom w:val="single" w:color="AAAAAA" w:sz="4"/>
-              <w:right w:val="single" w:color="AAAAAA" w:sz="4"/>
-            </w:tcBorders>
-            <w:tcMar>
-              <w:top w:type="dxa" w:w="80"/>
-              <w:left w:type="dxa" w:w="120"/>
-              <w:bottom w:type="dxa" w:w="80"/>
-              <w:right w:type="dxa" w:w="120"/>
-            </w:tcMar>
-          </w:tcPr>
-          <w:p>
-            <w:r>
-              <w:rPr>
-                <w:sz w:val="20"/>
-                <w:szCs w:val="20"/>
+            <w:tcW w:type="dxa" w:w="971"/>
+            <w:tcBorders>
+              <w:top w:val="single" w:color="AAAAAA" w:sz="4"/>
+              <w:left w:val="single" w:color="AAAAAA" w:sz="4"/>
+              <w:bottom w:val="single" w:color="AAAAAA" w:sz="4"/>
+              <w:right w:val="single" w:color="AAAAAA" w:sz="4"/>
+            </w:tcBorders>
+            <w:tcMar>
+              <w:top w:type="dxa" w:w="40"/>
+              <w:left w:type="dxa" w:w="80"/>
+              <w:bottom w:type="dxa" w:w="40"/>
+              <w:right w:type="dxa" w:w="80"/>
+            </w:tcMar>
+          </w:tcPr>
+          <w:p>
+            <w:r>
+              <w:rPr>
+                <w:sz w:val="14"/>
+                <w:szCs w:val="14"/>
               </w:rPr>
               <w:t xml:space="preserve">Pavilhão Escolar</w:t>
             </w:r>
@@ -396,25 +681,51 @@
         </w:tc>
         <w:tc>
           <w:tcPr>
-            <w:tcW w:type="dxa" w:w="1927"/>
-            <w:tcBorders>
-              <w:top w:val="single" w:color="AAAAAA" w:sz="4"/>
-              <w:left w:val="single" w:color="AAAAAA" w:sz="4"/>
-              <w:bottom w:val="single" w:color="AAAAAA" w:sz="4"/>
-              <w:right w:val="single" w:color="AAAAAA" w:sz="4"/>
-            </w:tcBorders>
-            <w:tcMar>
-              <w:top w:type="dxa" w:w="80"/>
-              <w:left w:type="dxa" w:w="120"/>
-              <w:bottom w:type="dxa" w:w="80"/>
-              <w:right w:type="dxa" w:w="120"/>
-            </w:tcMar>
-          </w:tcPr>
-          <w:p>
-            <w:r>
-              <w:rPr>
-                <w:sz w:val="20"/>
-                <w:szCs w:val="20"/>
+            <w:tcW w:type="dxa" w:w="963"/>
+            <w:tcBorders>
+              <w:top w:val="single" w:color="AAAAAA" w:sz="4"/>
+              <w:left w:val="single" w:color="AAAAAA" w:sz="4"/>
+              <w:bottom w:val="single" w:color="AAAAAA" w:sz="4"/>
+              <w:right w:val="single" w:color="AAAAAA" w:sz="4"/>
+            </w:tcBorders>
+            <w:tcMar>
+              <w:top w:type="dxa" w:w="40"/>
+              <w:left w:type="dxa" w:w="80"/>
+              <w:bottom w:type="dxa" w:w="40"/>
+              <w:right w:type="dxa" w:w="80"/>
+            </w:tcMar>
+          </w:tcPr>
+          <w:p>
+            <w:r>
+              <w:rPr>
+                <w:sz w:val="14"/>
+                <w:szCs w:val="14"/>
+              </w:rPr>
+              <w:t xml:space="preserve">EB Vila Feliz</w:t>
+            </w:r>
+          </w:p>
+        </w:tc>
+        <w:tc>
+          <w:tcPr>
+            <w:tcW w:type="dxa" w:w="963"/>
+            <w:tcBorders>
+              <w:top w:val="single" w:color="AAAAAA" w:sz="4"/>
+              <w:left w:val="single" w:color="AAAAAA" w:sz="4"/>
+              <w:bottom w:val="single" w:color="AAAAAA" w:sz="4"/>
+              <w:right w:val="single" w:color="AAAAAA" w:sz="4"/>
+            </w:tcBorders>
+            <w:tcMar>
+              <w:top w:type="dxa" w:w="40"/>
+              <w:left w:type="dxa" w:w="80"/>
+              <w:bottom w:type="dxa" w:w="40"/>
+              <w:right w:type="dxa" w:w="80"/>
+            </w:tcMar>
+          </w:tcPr>
+          <w:p>
+            <w:r>
+              <w:rPr>
+                <w:sz w:val="14"/>
+                <w:szCs w:val="14"/>
               </w:rPr>
               <w:t xml:space="preserve">Construções Silva</w:t>
             </w:r>
@@ -422,25 +733,25 @@
         </w:tc>
         <w:tc>
           <w:tcPr>
-            <w:tcW w:type="dxa" w:w="1927"/>
-            <w:tcBorders>
-              <w:top w:val="single" w:color="AAAAAA" w:sz="4"/>
-              <w:left w:val="single" w:color="AAAAAA" w:sz="4"/>
-              <w:bottom w:val="single" w:color="AAAAAA" w:sz="4"/>
-              <w:right w:val="single" w:color="AAAAAA" w:sz="4"/>
-            </w:tcBorders>
-            <w:tcMar>
-              <w:top w:type="dxa" w:w="80"/>
-              <w:left w:type="dxa" w:w="120"/>
-              <w:bottom w:type="dxa" w:w="80"/>
-              <w:right w:type="dxa" w:w="120"/>
-            </w:tcMar>
-          </w:tcPr>
-          <w:p>
-            <w:r>
-              <w:rPr>
-                <w:sz w:val="20"/>
-                <w:szCs w:val="20"/>
+            <w:tcW w:type="dxa" w:w="963"/>
+            <w:tcBorders>
+              <w:top w:val="single" w:color="AAAAAA" w:sz="4"/>
+              <w:left w:val="single" w:color="AAAAAA" w:sz="4"/>
+              <w:bottom w:val="single" w:color="AAAAAA" w:sz="4"/>
+              <w:right w:val="single" w:color="AAAAAA" w:sz="4"/>
+            </w:tcBorders>
+            <w:tcMar>
+              <w:top w:type="dxa" w:w="40"/>
+              <w:left w:type="dxa" w:w="80"/>
+              <w:bottom w:type="dxa" w:w="40"/>
+              <w:right w:type="dxa" w:w="80"/>
+            </w:tcMar>
+          </w:tcPr>
+          <w:p>
+            <w:r>
+              <w:rPr>
+                <w:sz w:val="14"/>
+                <w:szCs w:val="14"/>
               </w:rPr>
               <w:t xml:space="preserve">501234567</w:t>
             </w:r>
@@ -448,25 +759,51 @@
         </w:tc>
         <w:tc>
           <w:tcPr>
-            <w:tcW w:type="dxa" w:w="1927"/>
-            <w:tcBorders>
-              <w:top w:val="single" w:color="AAAAAA" w:sz="4"/>
-              <w:left w:val="single" w:color="AAAAAA" w:sz="4"/>
-              <w:bottom w:val="single" w:color="AAAAAA" w:sz="4"/>
-              <w:right w:val="single" w:color="AAAAAA" w:sz="4"/>
-            </w:tcBorders>
-            <w:tcMar>
-              <w:top w:type="dxa" w:w="80"/>
-              <w:left w:type="dxa" w:w="120"/>
-              <w:bottom w:type="dxa" w:w="80"/>
-              <w:right w:type="dxa" w:w="120"/>
-            </w:tcMar>
-          </w:tcPr>
-          <w:p>
-            <w:r>
-              <w:rPr>
-                <w:sz w:val="20"/>
-                <w:szCs w:val="20"/>
+            <w:tcW w:type="dxa" w:w="963"/>
+            <w:tcBorders>
+              <w:top w:val="single" w:color="AAAAAA" w:sz="4"/>
+              <w:left w:val="single" w:color="AAAAAA" w:sz="4"/>
+              <w:bottom w:val="single" w:color="AAAAAA" w:sz="4"/>
+              <w:right w:val="single" w:color="AAAAAA" w:sz="4"/>
+            </w:tcBorders>
+            <w:tcMar>
+              <w:top w:type="dxa" w:w="40"/>
+              <w:left w:type="dxa" w:w="80"/>
+              <w:bottom w:type="dxa" w:w="40"/>
+              <w:right w:type="dxa" w:w="80"/>
+            </w:tcMar>
+          </w:tcPr>
+          <w:p>
+            <w:r>
+              <w:rPr>
+                <w:sz w:val="14"/>
+                <w:szCs w:val="14"/>
+              </w:rPr>
+              <w:t xml:space="preserve">J. Silva / 918...</w:t>
+            </w:r>
+          </w:p>
+        </w:tc>
+        <w:tc>
+          <w:tcPr>
+            <w:tcW w:type="dxa" w:w="963"/>
+            <w:tcBorders>
+              <w:top w:val="single" w:color="AAAAAA" w:sz="4"/>
+              <w:left w:val="single" w:color="AAAAAA" w:sz="4"/>
+              <w:bottom w:val="single" w:color="AAAAAA" w:sz="4"/>
+              <w:right w:val="single" w:color="AAAAAA" w:sz="4"/>
+            </w:tcBorders>
+            <w:tcMar>
+              <w:top w:type="dxa" w:w="40"/>
+              <w:left w:type="dxa" w:w="80"/>
+              <w:bottom w:type="dxa" w:w="40"/>
+              <w:right w:type="dxa" w:w="80"/>
+            </w:tcMar>
+          </w:tcPr>
+          <w:p>
+            <w:r>
+              <w:rPr>
+                <w:sz w:val="14"/>
+                <w:szCs w:val="14"/>
               </w:rPr>
               <w:t xml:space="preserve">Eng. Pedro Lopes</w:t>
             </w:r>
@@ -474,27 +811,105 @@
         </w:tc>
         <w:tc>
           <w:tcPr>
-            <w:tcW w:type="dxa" w:w="1927"/>
-            <w:tcBorders>
-              <w:top w:val="single" w:color="AAAAAA" w:sz="4"/>
-              <w:left w:val="single" w:color="AAAAAA" w:sz="4"/>
-              <w:bottom w:val="single" w:color="AAAAAA" w:sz="4"/>
-              <w:right w:val="single" w:color="AAAAAA" w:sz="4"/>
-            </w:tcBorders>
-            <w:tcMar>
-              <w:top w:type="dxa" w:w="80"/>
-              <w:left w:type="dxa" w:w="120"/>
-              <w:bottom w:type="dxa" w:w="80"/>
-              <w:right w:type="dxa" w:w="120"/>
-            </w:tcMar>
-          </w:tcPr>
-          <w:p>
-            <w:r>
-              <w:rPr>
-                <w:sz w:val="20"/>
-                <w:szCs w:val="20"/>
+            <w:tcW w:type="dxa" w:w="963"/>
+            <w:tcBorders>
+              <w:top w:val="single" w:color="AAAAAA" w:sz="4"/>
+              <w:left w:val="single" w:color="AAAAAA" w:sz="4"/>
+              <w:bottom w:val="single" w:color="AAAAAA" w:sz="4"/>
+              <w:right w:val="single" w:color="AAAAAA" w:sz="4"/>
+            </w:tcBorders>
+            <w:tcMar>
+              <w:top w:type="dxa" w:w="40"/>
+              <w:left w:type="dxa" w:w="80"/>
+              <w:bottom w:type="dxa" w:w="40"/>
+              <w:right w:type="dxa" w:w="80"/>
+            </w:tcMar>
+          </w:tcPr>
+          <w:p>
+            <w:r>
+              <w:rPr>
+                <w:sz w:val="14"/>
+                <w:szCs w:val="14"/>
+              </w:rPr>
+              <w:t xml:space="preserve">2024-11-15</w:t>
+            </w:r>
+          </w:p>
+        </w:tc>
+        <w:tc>
+          <w:tcPr>
+            <w:tcW w:type="dxa" w:w="963"/>
+            <w:tcBorders>
+              <w:top w:val="single" w:color="AAAAAA" w:sz="4"/>
+              <w:left w:val="single" w:color="AAAAAA" w:sz="4"/>
+              <w:bottom w:val="single" w:color="AAAAAA" w:sz="4"/>
+              <w:right w:val="single" w:color="AAAAAA" w:sz="4"/>
+            </w:tcBorders>
+            <w:tcMar>
+              <w:top w:type="dxa" w:w="40"/>
+              <w:left w:type="dxa" w:w="80"/>
+              <w:bottom w:type="dxa" w:w="40"/>
+              <w:right w:type="dxa" w:w="80"/>
+            </w:tcMar>
+          </w:tcPr>
+          <w:p>
+            <w:r>
+              <w:rPr>
+                <w:sz w:val="14"/>
+                <w:szCs w:val="14"/>
+              </w:rPr>
+              <w:t xml:space="preserve">2025-06-30</w:t>
+            </w:r>
+          </w:p>
+        </w:tc>
+        <w:tc>
+          <w:tcPr>
+            <w:tcW w:type="dxa" w:w="963"/>
+            <w:tcBorders>
+              <w:top w:val="single" w:color="AAAAAA" w:sz="4"/>
+              <w:left w:val="single" w:color="AAAAAA" w:sz="4"/>
+              <w:bottom w:val="single" w:color="AAAAAA" w:sz="4"/>
+              <w:right w:val="single" w:color="AAAAAA" w:sz="4"/>
+            </w:tcBorders>
+            <w:tcMar>
+              <w:top w:type="dxa" w:w="40"/>
+              <w:left w:type="dxa" w:w="80"/>
+              <w:bottom w:type="dxa" w:w="40"/>
+              <w:right w:type="dxa" w:w="80"/>
+            </w:tcMar>
+          </w:tcPr>
+          <w:p>
+            <w:r>
+              <w:rPr>
+                <w:sz w:val="14"/>
+                <w:szCs w:val="14"/>
               </w:rPr>
               <w:t xml:space="preserve">320 000€</w:t>
+            </w:r>
+          </w:p>
+        </w:tc>
+        <w:tc>
+          <w:tcPr>
+            <w:tcW w:type="dxa" w:w="963"/>
+            <w:tcBorders>
+              <w:top w:val="single" w:color="AAAAAA" w:sz="4"/>
+              <w:left w:val="single" w:color="AAAAAA" w:sz="4"/>
+              <w:bottom w:val="single" w:color="AAAAAA" w:sz="4"/>
+              <w:right w:val="single" w:color="AAAAAA" w:sz="4"/>
+            </w:tcBorders>
+            <w:tcMar>
+              <w:top w:type="dxa" w:w="40"/>
+              <w:left w:type="dxa" w:w="80"/>
+              <w:bottom w:type="dxa" w:w="40"/>
+              <w:right w:type="dxa" w:w="80"/>
+            </w:tcMar>
+          </w:tcPr>
+          <w:p>
+            <w:r>
+              <w:rPr>
+                <w:sz w:val="14"/>
+                <w:szCs w:val="14"/>
+              </w:rPr>
+              <w:t xml:space="preserve">Em curso</w:t>
             </w:r>
           </w:p>
         </w:tc>
@@ -502,25 +917,25 @@
       <w:tr>
         <w:tc>
           <w:tcPr>
-            <w:tcW w:type="dxa" w:w="1930"/>
-            <w:tcBorders>
-              <w:top w:val="single" w:color="AAAAAA" w:sz="4"/>
-              <w:left w:val="single" w:color="AAAAAA" w:sz="4"/>
-              <w:bottom w:val="single" w:color="AAAAAA" w:sz="4"/>
-              <w:right w:val="single" w:color="AAAAAA" w:sz="4"/>
-            </w:tcBorders>
-            <w:tcMar>
-              <w:top w:type="dxa" w:w="80"/>
-              <w:left w:type="dxa" w:w="120"/>
-              <w:bottom w:type="dxa" w:w="80"/>
-              <w:right w:type="dxa" w:w="120"/>
-            </w:tcMar>
-          </w:tcPr>
-          <w:p>
-            <w:r>
-              <w:rPr>
-                <w:sz w:val="20"/>
-                <w:szCs w:val="20"/>
+            <w:tcW w:type="dxa" w:w="971"/>
+            <w:tcBorders>
+              <w:top w:val="single" w:color="AAAAAA" w:sz="4"/>
+              <w:left w:val="single" w:color="AAAAAA" w:sz="4"/>
+              <w:bottom w:val="single" w:color="AAAAAA" w:sz="4"/>
+              <w:right w:val="single" w:color="AAAAAA" w:sz="4"/>
+            </w:tcBorders>
+            <w:tcMar>
+              <w:top w:type="dxa" w:w="40"/>
+              <w:left w:type="dxa" w:w="80"/>
+              <w:bottom w:type="dxa" w:w="40"/>
+              <w:right w:type="dxa" w:w="80"/>
+            </w:tcMar>
+          </w:tcPr>
+          <w:p>
+            <w:r>
+              <w:rPr>
+                <w:sz w:val="14"/>
+                <w:szCs w:val="14"/>
               </w:rPr>
               <w:t xml:space="preserve">Parque Urbano</w:t>
             </w:r>
@@ -528,25 +943,51 @@
         </w:tc>
         <w:tc>
           <w:tcPr>
-            <w:tcW w:type="dxa" w:w="1927"/>
-            <w:tcBorders>
-              <w:top w:val="single" w:color="AAAAAA" w:sz="4"/>
-              <w:left w:val="single" w:color="AAAAAA" w:sz="4"/>
-              <w:bottom w:val="single" w:color="AAAAAA" w:sz="4"/>
-              <w:right w:val="single" w:color="AAAAAA" w:sz="4"/>
-            </w:tcBorders>
-            <w:tcMar>
-              <w:top w:type="dxa" w:w="80"/>
-              <w:left w:type="dxa" w:w="120"/>
-              <w:bottom w:type="dxa" w:w="80"/>
-              <w:right w:type="dxa" w:w="120"/>
-            </w:tcMar>
-          </w:tcPr>
-          <w:p>
-            <w:r>
-              <w:rPr>
-                <w:sz w:val="20"/>
-                <w:szCs w:val="20"/>
+            <w:tcW w:type="dxa" w:w="963"/>
+            <w:tcBorders>
+              <w:top w:val="single" w:color="AAAAAA" w:sz="4"/>
+              <w:left w:val="single" w:color="AAAAAA" w:sz="4"/>
+              <w:bottom w:val="single" w:color="AAAAAA" w:sz="4"/>
+              <w:right w:val="single" w:color="AAAAAA" w:sz="4"/>
+            </w:tcBorders>
+            <w:tcMar>
+              <w:top w:type="dxa" w:w="40"/>
+              <w:left w:type="dxa" w:w="80"/>
+              <w:bottom w:type="dxa" w:w="40"/>
+              <w:right w:type="dxa" w:w="80"/>
+            </w:tcMar>
+          </w:tcPr>
+          <w:p>
+            <w:r>
+              <w:rPr>
+                <w:sz w:val="14"/>
+                <w:szCs w:val="14"/>
+              </w:rPr>
+              <w:t xml:space="preserve">Zona Norte</w:t>
+            </w:r>
+          </w:p>
+        </w:tc>
+        <w:tc>
+          <w:tcPr>
+            <w:tcW w:type="dxa" w:w="963"/>
+            <w:tcBorders>
+              <w:top w:val="single" w:color="AAAAAA" w:sz="4"/>
+              <w:left w:val="single" w:color="AAAAAA" w:sz="4"/>
+              <w:bottom w:val="single" w:color="AAAAAA" w:sz="4"/>
+              <w:right w:val="single" w:color="AAAAAA" w:sz="4"/>
+            </w:tcBorders>
+            <w:tcMar>
+              <w:top w:type="dxa" w:w="40"/>
+              <w:left w:type="dxa" w:w="80"/>
+              <w:bottom w:type="dxa" w:w="40"/>
+              <w:right w:type="dxa" w:w="80"/>
+            </w:tcMar>
+          </w:tcPr>
+          <w:p>
+            <w:r>
+              <w:rPr>
+                <w:sz w:val="14"/>
+                <w:szCs w:val="14"/>
               </w:rPr>
               <w:t xml:space="preserve">Jardins &amp; Co</w:t>
             </w:r>
@@ -554,25 +995,25 @@
         </w:tc>
         <w:tc>
           <w:tcPr>
-            <w:tcW w:type="dxa" w:w="1927"/>
-            <w:tcBorders>
-              <w:top w:val="single" w:color="AAAAAA" w:sz="4"/>
-              <w:left w:val="single" w:color="AAAAAA" w:sz="4"/>
-              <w:bottom w:val="single" w:color="AAAAAA" w:sz="4"/>
-              <w:right w:val="single" w:color="AAAAAA" w:sz="4"/>
-            </w:tcBorders>
-            <w:tcMar>
-              <w:top w:type="dxa" w:w="80"/>
-              <w:left w:type="dxa" w:w="120"/>
-              <w:bottom w:type="dxa" w:w="80"/>
-              <w:right w:type="dxa" w:w="120"/>
-            </w:tcMar>
-          </w:tcPr>
-          <w:p>
-            <w:r>
-              <w:rPr>
-                <w:sz w:val="20"/>
-                <w:szCs w:val="20"/>
+            <w:tcW w:type="dxa" w:w="963"/>
+            <w:tcBorders>
+              <w:top w:val="single" w:color="AAAAAA" w:sz="4"/>
+              <w:left w:val="single" w:color="AAAAAA" w:sz="4"/>
+              <w:bottom w:val="single" w:color="AAAAAA" w:sz="4"/>
+              <w:right w:val="single" w:color="AAAAAA" w:sz="4"/>
+            </w:tcBorders>
+            <w:tcMar>
+              <w:top w:type="dxa" w:w="40"/>
+              <w:left w:type="dxa" w:w="80"/>
+              <w:bottom w:type="dxa" w:w="40"/>
+              <w:right w:type="dxa" w:w="80"/>
+            </w:tcMar>
+          </w:tcPr>
+          <w:p>
+            <w:r>
+              <w:rPr>
+                <w:sz w:val="14"/>
+                <w:szCs w:val="14"/>
               </w:rPr>
               <w:t xml:space="preserve">509876543</w:t>
             </w:r>
@@ -580,25 +1021,51 @@
         </w:tc>
         <w:tc>
           <w:tcPr>
-            <w:tcW w:type="dxa" w:w="1927"/>
-            <w:tcBorders>
-              <w:top w:val="single" w:color="AAAAAA" w:sz="4"/>
-              <w:left w:val="single" w:color="AAAAAA" w:sz="4"/>
-              <w:bottom w:val="single" w:color="AAAAAA" w:sz="4"/>
-              <w:right w:val="single" w:color="AAAAAA" w:sz="4"/>
-            </w:tcBorders>
-            <w:tcMar>
-              <w:top w:type="dxa" w:w="80"/>
-              <w:left w:type="dxa" w:w="120"/>
-              <w:bottom w:type="dxa" w:w="80"/>
-              <w:right w:type="dxa" w:w="120"/>
-            </w:tcMar>
-          </w:tcPr>
-          <w:p>
-            <w:r>
-              <w:rPr>
-                <w:sz w:val="20"/>
-                <w:szCs w:val="20"/>
+            <w:tcW w:type="dxa" w:w="963"/>
+            <w:tcBorders>
+              <w:top w:val="single" w:color="AAAAAA" w:sz="4"/>
+              <w:left w:val="single" w:color="AAAAAA" w:sz="4"/>
+              <w:bottom w:val="single" w:color="AAAAAA" w:sz="4"/>
+              <w:right w:val="single" w:color="AAAAAA" w:sz="4"/>
+            </w:tcBorders>
+            <w:tcMar>
+              <w:top w:type="dxa" w:w="40"/>
+              <w:left w:type="dxa" w:w="80"/>
+              <w:bottom w:type="dxa" w:w="40"/>
+              <w:right w:type="dxa" w:w="80"/>
+            </w:tcMar>
+          </w:tcPr>
+          <w:p>
+            <w:r>
+              <w:rPr>
+                <w:sz w:val="14"/>
+                <w:szCs w:val="14"/>
+              </w:rPr>
+              <w:t xml:space="preserve">M. Jardim / 926...</w:t>
+            </w:r>
+          </w:p>
+        </w:tc>
+        <w:tc>
+          <w:tcPr>
+            <w:tcW w:type="dxa" w:w="963"/>
+            <w:tcBorders>
+              <w:top w:val="single" w:color="AAAAAA" w:sz="4"/>
+              <w:left w:val="single" w:color="AAAAAA" w:sz="4"/>
+              <w:bottom w:val="single" w:color="AAAAAA" w:sz="4"/>
+              <w:right w:val="single" w:color="AAAAAA" w:sz="4"/>
+            </w:tcBorders>
+            <w:tcMar>
+              <w:top w:type="dxa" w:w="40"/>
+              <w:left w:type="dxa" w:w="80"/>
+              <w:bottom w:type="dxa" w:w="40"/>
+              <w:right w:type="dxa" w:w="80"/>
+            </w:tcMar>
+          </w:tcPr>
+          <w:p>
+            <w:r>
+              <w:rPr>
+                <w:sz w:val="14"/>
+                <w:szCs w:val="14"/>
               </w:rPr>
               <w:t xml:space="preserve">Eng. Ana Costa</w:t>
             </w:r>
@@ -606,27 +1073,105 @@
         </w:tc>
         <w:tc>
           <w:tcPr>
-            <w:tcW w:type="dxa" w:w="1927"/>
-            <w:tcBorders>
-              <w:top w:val="single" w:color="AAAAAA" w:sz="4"/>
-              <w:left w:val="single" w:color="AAAAAA" w:sz="4"/>
-              <w:bottom w:val="single" w:color="AAAAAA" w:sz="4"/>
-              <w:right w:val="single" w:color="AAAAAA" w:sz="4"/>
-            </w:tcBorders>
-            <w:tcMar>
-              <w:top w:type="dxa" w:w="80"/>
-              <w:left w:type="dxa" w:w="120"/>
-              <w:bottom w:type="dxa" w:w="80"/>
-              <w:right w:type="dxa" w:w="120"/>
-            </w:tcMar>
-          </w:tcPr>
-          <w:p>
-            <w:r>
-              <w:rPr>
-                <w:sz w:val="20"/>
-                <w:szCs w:val="20"/>
+            <w:tcW w:type="dxa" w:w="963"/>
+            <w:tcBorders>
+              <w:top w:val="single" w:color="AAAAAA" w:sz="4"/>
+              <w:left w:val="single" w:color="AAAAAA" w:sz="4"/>
+              <w:bottom w:val="single" w:color="AAAAAA" w:sz="4"/>
+              <w:right w:val="single" w:color="AAAAAA" w:sz="4"/>
+            </w:tcBorders>
+            <w:tcMar>
+              <w:top w:type="dxa" w:w="40"/>
+              <w:left w:type="dxa" w:w="80"/>
+              <w:bottom w:type="dxa" w:w="40"/>
+              <w:right w:type="dxa" w:w="80"/>
+            </w:tcMar>
+          </w:tcPr>
+          <w:p>
+            <w:r>
+              <w:rPr>
+                <w:sz w:val="14"/>
+                <w:szCs w:val="14"/>
+              </w:rPr>
+              <w:t xml:space="preserve">2025-01-10</w:t>
+            </w:r>
+          </w:p>
+        </w:tc>
+        <w:tc>
+          <w:tcPr>
+            <w:tcW w:type="dxa" w:w="963"/>
+            <w:tcBorders>
+              <w:top w:val="single" w:color="AAAAAA" w:sz="4"/>
+              <w:left w:val="single" w:color="AAAAAA" w:sz="4"/>
+              <w:bottom w:val="single" w:color="AAAAAA" w:sz="4"/>
+              <w:right w:val="single" w:color="AAAAAA" w:sz="4"/>
+            </w:tcBorders>
+            <w:tcMar>
+              <w:top w:type="dxa" w:w="40"/>
+              <w:left w:type="dxa" w:w="80"/>
+              <w:bottom w:type="dxa" w:w="40"/>
+              <w:right w:type="dxa" w:w="80"/>
+            </w:tcMar>
+          </w:tcPr>
+          <w:p>
+            <w:r>
+              <w:rPr>
+                <w:sz w:val="14"/>
+                <w:szCs w:val="14"/>
+              </w:rPr>
+              <w:t xml:space="preserve">2025-08-30</w:t>
+            </w:r>
+          </w:p>
+        </w:tc>
+        <w:tc>
+          <w:tcPr>
+            <w:tcW w:type="dxa" w:w="963"/>
+            <w:tcBorders>
+              <w:top w:val="single" w:color="AAAAAA" w:sz="4"/>
+              <w:left w:val="single" w:color="AAAAAA" w:sz="4"/>
+              <w:bottom w:val="single" w:color="AAAAAA" w:sz="4"/>
+              <w:right w:val="single" w:color="AAAAAA" w:sz="4"/>
+            </w:tcBorders>
+            <w:tcMar>
+              <w:top w:type="dxa" w:w="40"/>
+              <w:left w:type="dxa" w:w="80"/>
+              <w:bottom w:type="dxa" w:w="40"/>
+              <w:right w:type="dxa" w:w="80"/>
+            </w:tcMar>
+          </w:tcPr>
+          <w:p>
+            <w:r>
+              <w:rPr>
+                <w:sz w:val="14"/>
+                <w:szCs w:val="14"/>
               </w:rPr>
               <w:t xml:space="preserve">175 000€</w:t>
+            </w:r>
+          </w:p>
+        </w:tc>
+        <w:tc>
+          <w:tcPr>
+            <w:tcW w:type="dxa" w:w="963"/>
+            <w:tcBorders>
+              <w:top w:val="single" w:color="AAAAAA" w:sz="4"/>
+              <w:left w:val="single" w:color="AAAAAA" w:sz="4"/>
+              <w:bottom w:val="single" w:color="AAAAAA" w:sz="4"/>
+              <w:right w:val="single" w:color="AAAAAA" w:sz="4"/>
+            </w:tcBorders>
+            <w:tcMar>
+              <w:top w:type="dxa" w:w="40"/>
+              <w:left w:type="dxa" w:w="80"/>
+              <w:bottom w:type="dxa" w:w="40"/>
+              <w:right w:type="dxa" w:w="80"/>
+            </w:tcMar>
+          </w:tcPr>
+          <w:p>
+            <w:r>
+              <w:rPr>
+                <w:sz w:val="14"/>
+                <w:szCs w:val="14"/>
+              </w:rPr>
+              <w:t xml:space="preserve">Adjudicada</w:t>
             </w:r>
           </w:p>
         </w:tc>

</xml_diff>